<commit_message>
se llevo solo a un tipo de telefono. STRING sin validar a JSON
</commit_message>
<xml_diff>
--- a/docs/Servilo_Kerno Cult API Justificacion .docx
+++ b/docs/Servilo_Kerno Cult API Justificacion .docx
@@ -66,9 +66,9 @@
         <w:gridCol w:w="1403"/>
         <w:gridCol w:w="1134"/>
         <w:gridCol w:w="1559"/>
-        <w:gridCol w:w="1559"/>
+        <w:gridCol w:w="1560"/>
         <w:gridCol w:w="1701"/>
-        <w:gridCol w:w="1813"/>
+        <w:gridCol w:w="1812"/>
       </w:tblGrid>
       <w:tr>
         <w:trPr>
@@ -190,7 +190,7 @@
         </w:tc>
         <w:tc>
           <w:tcPr>
-            <w:tcW w:w="1559" w:type="dxa"/>
+            <w:tcW w:w="1560" w:type="dxa"/>
             <w:tcBorders>
               <w:top w:val="single" w:sz="4" w:space="0" w:color="000000"/>
               <w:left w:val="single" w:sz="4" w:space="0" w:color="000000"/>
@@ -262,7 +262,7 @@
         </w:tc>
         <w:tc>
           <w:tcPr>
-            <w:tcW w:w="1813" w:type="dxa"/>
+            <w:tcW w:w="1812" w:type="dxa"/>
             <w:tcBorders>
               <w:top w:val="single" w:sz="4" w:space="0" w:color="000000"/>
               <w:left w:val="single" w:sz="4" w:space="0" w:color="000000"/>
@@ -2182,13 +2182,7 @@
               <w:rPr>
                 <w:lang w:val="es-ES"/>
               </w:rPr>
-              <w:t xml:space="preserve"> </w:t>
-            </w:r>
-            <w:r>
-              <w:rPr>
-                <w:lang w:val="es-ES"/>
-              </w:rPr>
-              <w:t>create(name,hierarchy)[Trz]:mínimo 3 letras, único y el id entidad</w:t>
+              <w:t xml:space="preserve"> create(name,hierarchy)[Trz]:mínimo 3 letras, único y el id entidad</w:t>
             </w:r>
           </w:p>
           <w:p>
@@ -2210,25 +2204,7 @@
               <w:rPr>
                 <w:lang w:val="es-ES"/>
               </w:rPr>
-              <w:t xml:space="preserve"> </w:t>
-            </w:r>
-            <w:r>
-              <w:rPr>
-                <w:lang w:val="es-ES"/>
-              </w:rPr>
-              <w:t>findAll(</w:t>
-            </w:r>
-            <w:r>
-              <w:rPr>
-                <w:lang w:val="es-ES"/>
-              </w:rPr>
-              <w:t>ID,</w:t>
-            </w:r>
-            <w:r>
-              <w:rPr>
-                <w:lang w:val="es-ES"/>
-              </w:rPr>
-              <w:t>paginaActual,cantidaXPagina):</w:t>
+              <w:t xml:space="preserve"> findAll(ID,paginaActual,cantidaXPagina):</w:t>
             </w:r>
           </w:p>
           <w:p>
@@ -2247,13 +2223,7 @@
               <w:rPr>
                 <w:lang w:val="es-ES"/>
               </w:rPr>
-              <w:t>los elementos de pagina son opcionales para la devolucion de todos.</w:t>
-            </w:r>
-            <w:r>
-              <w:rPr>
-                <w:lang w:val="es-ES"/>
-              </w:rPr>
-              <w:t>se devuelven todos los elementos en paginación</w:t>
+              <w:t>los elementos de pagina son opcionales para la devolucion de todos.se devuelven todos los elementos en paginación</w:t>
             </w:r>
           </w:p>
           <w:p>
@@ -2318,13 +2288,7 @@
               <w:rPr>
                 <w:lang w:val="es-ES"/>
               </w:rPr>
-              <w:t xml:space="preserve"> </w:t>
-            </w:r>
-            <w:r>
-              <w:rPr>
-                <w:lang w:val="es-ES"/>
-              </w:rPr>
-              <w:t>update(datos)[Trz]:se actualizan los datos de ese elemento en específico.</w:t>
+              <w:t xml:space="preserve"> update(datos)[Trz]:se actualizan los datos de ese elemento en específico.</w:t>
             </w:r>
           </w:p>
           <w:p>
@@ -2346,13 +2310,7 @@
               <w:rPr>
                 <w:lang w:val="es-ES"/>
               </w:rPr>
-              <w:t xml:space="preserve"> </w:t>
-            </w:r>
-            <w:r>
-              <w:rPr>
-                <w:lang w:val="es-ES"/>
-              </w:rPr>
-              <w:t>remove(id)[Trz]:elimina de forma lógica el elemento</w:t>
+              <w:t xml:space="preserve"> remove(id)[Trz]:elimina de forma lógica el elemento</w:t>
             </w:r>
           </w:p>
           <w:p>
@@ -2715,13 +2673,7 @@
               <w:rPr>
                 <w:lang w:val="es-ES"/>
               </w:rPr>
-              <w:t xml:space="preserve"> </w:t>
-            </w:r>
-            <w:r>
-              <w:rPr>
-                <w:lang w:val="es-ES"/>
-              </w:rPr>
-              <w:t>create(name,hierarchy)[Trz]:mínimo 3 letras, único y el id entidad</w:t>
+              <w:t xml:space="preserve"> create(name,hierarchy)[Trz]:mínimo 3 letras, único y el id entidad</w:t>
             </w:r>
           </w:p>
           <w:p>
@@ -2743,25 +2695,7 @@
               <w:rPr>
                 <w:lang w:val="es-ES"/>
               </w:rPr>
-              <w:t xml:space="preserve"> </w:t>
-            </w:r>
-            <w:r>
-              <w:rPr>
-                <w:lang w:val="es-ES"/>
-              </w:rPr>
-              <w:t>findAll(</w:t>
-            </w:r>
-            <w:r>
-              <w:rPr>
-                <w:lang w:val="es-ES"/>
-              </w:rPr>
-              <w:t>ID,</w:t>
-            </w:r>
-            <w:r>
-              <w:rPr>
-                <w:lang w:val="es-ES"/>
-              </w:rPr>
-              <w:t>paginaActual,cantidaXPagina):</w:t>
+              <w:t xml:space="preserve"> findAll(ID,paginaActual,cantidaXPagina):</w:t>
             </w:r>
           </w:p>
           <w:p>
@@ -2780,13 +2714,7 @@
               <w:rPr>
                 <w:lang w:val="es-ES"/>
               </w:rPr>
-              <w:t>los elementos de pagina son opcionales para la devolucion de todos.</w:t>
-            </w:r>
-            <w:r>
-              <w:rPr>
-                <w:lang w:val="es-ES"/>
-              </w:rPr>
-              <w:t>se devuelven todos los elementos en paginación</w:t>
+              <w:t>los elementos de pagina son opcionales para la devolucion de todos.se devuelven todos los elementos en paginación</w:t>
             </w:r>
           </w:p>
           <w:p>
@@ -2851,13 +2779,7 @@
               <w:rPr>
                 <w:lang w:val="es-ES"/>
               </w:rPr>
-              <w:t xml:space="preserve"> </w:t>
-            </w:r>
-            <w:r>
-              <w:rPr>
-                <w:lang w:val="es-ES"/>
-              </w:rPr>
-              <w:t>update(datos)[Trz]:se actualizan los datos de ese elemento en específico.</w:t>
+              <w:t xml:space="preserve"> update(datos)[Trz]:se actualizan los datos de ese elemento en específico.</w:t>
             </w:r>
           </w:p>
           <w:p>
@@ -2879,13 +2801,7 @@
               <w:rPr>
                 <w:lang w:val="es-ES"/>
               </w:rPr>
-              <w:t xml:space="preserve"> </w:t>
-            </w:r>
-            <w:r>
-              <w:rPr>
-                <w:lang w:val="es-ES"/>
-              </w:rPr>
-              <w:t>remove(id)[Trz]:elimina de forma lógica el elemento</w:t>
+              <w:t xml:space="preserve"> remove(id)[Trz]:elimina de forma lógica el elemento</w:t>
             </w:r>
           </w:p>
           <w:p>
@@ -2992,13 +2908,7 @@
               <w:rPr>
                 <w:lang w:val="es-ES"/>
               </w:rPr>
-              <w:t>-</w:t>
-            </w:r>
-            <w:r>
-              <w:rPr>
-                <w:lang w:val="es-ES"/>
-              </w:rPr>
-              <w:t>API_Struct</w:t>
+              <w:t>-API_Struct</w:t>
             </w:r>
           </w:p>
         </w:tc>
@@ -4751,36 +4661,66 @@
             </w:pPr>
             <w:r>
               <w:rPr>
-                <w:lang w:val="es-ES"/>
-              </w:rPr>
-              <w:t>create(name,hierarchy)[Trz]:mínimo 3 letras, único y orden jerarquico del 0(Ministerio) hasta el 4(Instituciones)</w:t>
-            </w:r>
-          </w:p>
-          <w:p>
-            <w:pPr>
-              <w:pStyle w:val="Normal"/>
-              <w:spacing w:before="0" w:after="0"/>
-              <w:rPr>
-                <w:lang w:val="es-ES"/>
-              </w:rPr>
-            </w:pPr>
-            <w:r>
-              <w:rPr>
-                <w:lang w:val="es-ES"/>
-              </w:rPr>
-              <w:t>findAll(paginaActual,cantidaXPagina):se devuelven todos los elementos en paginación</w:t>
-            </w:r>
-          </w:p>
-          <w:p>
-            <w:pPr>
-              <w:pStyle w:val="Normal"/>
-              <w:spacing w:before="0" w:after="0"/>
-              <w:rPr>
-                <w:lang w:val="es-ES"/>
-              </w:rPr>
-            </w:pPr>
-            <w:r>
-              <w:rPr>
+                <w:rStyle w:val="Emphasis"/>
+                <w:b/>
+                <w:bCs/>
+                <w:shd w:fill="81D41A" w:val="clear"/>
+                <w:lang w:val="es-ES"/>
+              </w:rPr>
+              <w:t>POST</w:t>
+            </w:r>
+            <w:r>
+              <w:rPr>
+                <w:lang w:val="es-ES"/>
+              </w:rPr>
+              <w:t xml:space="preserve">create(...)[Trz]:mínimo 3 letras, único </w:t>
+            </w:r>
+          </w:p>
+          <w:p>
+            <w:pPr>
+              <w:pStyle w:val="Normal"/>
+              <w:spacing w:before="0" w:after="0"/>
+              <w:rPr>
+                <w:lang w:val="es-ES"/>
+              </w:rPr>
+            </w:pPr>
+            <w:r>
+              <w:rPr>
+                <w:shd w:fill="FFBF00" w:val="clear"/>
+                <w:lang w:val="es-ES"/>
+              </w:rPr>
+              <w:t>PUT</w:t>
+            </w:r>
+            <w:r>
+              <w:rPr>
+                <w:lang w:val="es-ES"/>
+              </w:rPr>
+              <w:t>findAll(</w:t>
+            </w:r>
+            <w:r>
+              <w:rPr>
+                <w:lang w:val="es-ES"/>
+              </w:rPr>
+              <w:t>id,</w:t>
+            </w:r>
+            <w:r>
+              <w:rPr>
+                <w:lang w:val="es-ES"/>
+              </w:rPr>
+              <w:t>paginaActual,cantidaXPagina):se devuelven todos los elementos en paginación</w:t>
+            </w:r>
+          </w:p>
+          <w:p>
+            <w:pPr>
+              <w:pStyle w:val="Normal"/>
+              <w:spacing w:before="0" w:after="0"/>
+              <w:rPr>
+                <w:strike/>
+              </w:rPr>
+            </w:pPr>
+            <w:r>
+              <w:rPr>
+                <w:strike/>
                 <w:lang w:val="es-ES"/>
               </w:rPr>
               <w:t>findOne(id):devuelve los atributos de ese documento en especifico</w:t>
@@ -4796,6 +4736,13 @@
             </w:pPr>
             <w:r>
               <w:rPr>
+                <w:shd w:fill="E8F2A1" w:val="clear"/>
+                <w:lang w:val="es-ES"/>
+              </w:rPr>
+              <w:t>PATCH</w:t>
+            </w:r>
+            <w:r>
+              <w:rPr>
                 <w:lang w:val="es-ES"/>
               </w:rPr>
               <w:t>update(id,datos)[Trz]:se actualizan los datos de ese elemento en específico.</w:t>
@@ -4811,6 +4758,19 @@
             </w:pPr>
             <w:r>
               <w:rPr>
+                <w:shd w:fill="FF4000" w:val="clear"/>
+                <w:lang w:val="es-ES"/>
+              </w:rPr>
+              <w:t>DELETE</w:t>
+            </w:r>
+            <w:r>
+              <w:rPr>
+                <w:lang w:val="es-ES"/>
+              </w:rPr>
+              <w:t xml:space="preserve"> </w:t>
+            </w:r>
+            <w:r>
+              <w:rPr>
                 <w:lang w:val="es-ES"/>
               </w:rPr>
               <w:t>remove(id)[Trz]:elimina de forma logica el elemento</w:t>
@@ -4824,6 +4784,32 @@
                 <w:lang w:val="es-ES"/>
               </w:rPr>
             </w:pPr>
+            <w:r>
+              <w:rPr>
+                <w:shd w:fill="81D41A" w:val="clear"/>
+                <w:lang w:val="es-ES"/>
+              </w:rPr>
+              <w:t>POST</w:t>
+            </w:r>
+            <w:r>
+              <w:rPr>
+                <w:lang w:val="es-ES"/>
+              </w:rPr>
+              <w:t xml:space="preserve"> </w:t>
+            </w:r>
+            <w:r>
+              <w:rPr>
+                <w:shd w:fill="5983B0" w:val="clear"/>
+                <w:lang w:val="es-ES"/>
+              </w:rPr>
+              <w:t>/srch</w:t>
+            </w:r>
+            <w:r>
+              <w:rPr>
+                <w:lang w:val="es-ES"/>
+              </w:rPr>
+              <w:t xml:space="preserve"> </w:t>
+            </w:r>
             <w:r>
               <w:rPr>
                 <w:lang w:val="es-ES"/>
@@ -11806,7 +11792,7 @@
     <w:pPr>
       <w:widowControl/>
       <w:suppressAutoHyphens w:val="true"/>
-      <w:overflowPunct w:val="false"/>
+      <w:overflowPunct w:val="true"/>
       <w:bidi w:val="0"/>
       <w:spacing w:before="0" w:after="160"/>
       <w:jc w:val="left"/>
@@ -11946,6 +11932,14 @@
       <w:rFonts w:ascii="OpenSymbol" w:hAnsi="OpenSymbol" w:eastAsia="OpenSymbol" w:cs="OpenSymbol"/>
     </w:rPr>
   </w:style>
+  <w:style w:type="character" w:styleId="Emphasis">
+    <w:name w:val="Emphasis"/>
+    <w:qFormat/>
+    <w:rPr>
+      <w:i/>
+      <w:iCs/>
+    </w:rPr>
+  </w:style>
   <w:style w:type="paragraph" w:styleId="Heading">
     <w:name w:val="Heading"/>
     <w:basedOn w:val="Standard"/>
@@ -12010,7 +12004,7 @@
     <w:pPr>
       <w:widowControl/>
       <w:suppressAutoHyphens w:val="true"/>
-      <w:overflowPunct w:val="false"/>
+      <w:overflowPunct w:val="true"/>
       <w:bidi w:val="0"/>
       <w:spacing w:before="0" w:after="160"/>
       <w:jc w:val="left"/>
@@ -12091,7 +12085,7 @@
     <w:pPr>
       <w:widowControl/>
       <w:suppressAutoHyphens w:val="true"/>
-      <w:overflowPunct w:val="false"/>
+      <w:overflowPunct w:val="true"/>
       <w:bidi w:val="0"/>
       <w:spacing w:before="0" w:after="0"/>
       <w:jc w:val="left"/>

</xml_diff>

<commit_message>
- correcto lo de aprobado y cancelado en ProySocCom - actualizados los Bruno de ProySocCom
</commit_message>
<xml_diff>
--- a/docs/Servilo_Kerno Cult API Justificacion .docx
+++ b/docs/Servilo_Kerno Cult API Justificacion .docx
@@ -4814,7 +4814,13 @@
               <w:rPr>
                 <w:lang w:val="es-ES"/>
               </w:rPr>
-              <w:t>search(criterio):se busca en criterios de nombre</w:t>
+              <w:t xml:space="preserve">search(criterio):se busca en criterios de nombre </w:t>
+            </w:r>
+            <w:r>
+              <w:rPr>
+                <w:lang w:val="es-ES"/>
+              </w:rPr>
+              <w:t>y otros</w:t>
             </w:r>
           </w:p>
         </w:tc>

</xml_diff>

<commit_message>
cambios en ActCult.Nomencladores de Edad funciona
</commit_message>
<xml_diff>
--- a/docs/Servilo_Kerno Cult API Justificacion .docx
+++ b/docs/Servilo_Kerno Cult API Justificacion .docx
@@ -67,8 +67,8 @@
         <w:gridCol w:w="1134"/>
         <w:gridCol w:w="1559"/>
         <w:gridCol w:w="1560"/>
-        <w:gridCol w:w="1701"/>
-        <w:gridCol w:w="1812"/>
+        <w:gridCol w:w="1702"/>
+        <w:gridCol w:w="1811"/>
       </w:tblGrid>
       <w:tr>
         <w:trPr>
@@ -226,7 +226,7 @@
         </w:tc>
         <w:tc>
           <w:tcPr>
-            <w:tcW w:w="1701" w:type="dxa"/>
+            <w:tcW w:w="1702" w:type="dxa"/>
             <w:tcBorders>
               <w:top w:val="single" w:sz="4" w:space="0" w:color="000000"/>
               <w:left w:val="single" w:sz="4" w:space="0" w:color="000000"/>
@@ -262,7 +262,7 @@
         </w:tc>
         <w:tc>
           <w:tcPr>
-            <w:tcW w:w="1812" w:type="dxa"/>
+            <w:tcW w:w="1811" w:type="dxa"/>
             <w:tcBorders>
               <w:top w:val="single" w:sz="4" w:space="0" w:color="000000"/>
               <w:left w:val="single" w:sz="4" w:space="0" w:color="000000"/>
@@ -4673,7 +4673,7 @@
               <w:rPr>
                 <w:lang w:val="es-ES"/>
               </w:rPr>
-              <w:t xml:space="preserve">create(...)[Trz]:mínimo 3 letras, único </w:t>
+              <w:t>create(...)[Trz]:mínimo 3 letras, único</w:t>
             </w:r>
           </w:p>
           <w:p>
@@ -4695,19 +4695,7 @@
               <w:rPr>
                 <w:lang w:val="es-ES"/>
               </w:rPr>
-              <w:t>findAll(</w:t>
-            </w:r>
-            <w:r>
-              <w:rPr>
-                <w:lang w:val="es-ES"/>
-              </w:rPr>
-              <w:t>id,</w:t>
-            </w:r>
-            <w:r>
-              <w:rPr>
-                <w:lang w:val="es-ES"/>
-              </w:rPr>
-              <w:t>paginaActual,cantidaXPagina):se devuelven todos los elementos en paginación</w:t>
+              <w:t>findAll(id,paginaActual,cantidaXPagina):se devuelven todos los elementos en paginación</w:t>
             </w:r>
           </w:p>
           <w:p>
@@ -4767,38 +4755,32 @@
               <w:rPr>
                 <w:lang w:val="es-ES"/>
               </w:rPr>
+              <w:t xml:space="preserve"> remove(id)[Trz]:elimina de forma logica el elemento</w:t>
+            </w:r>
+          </w:p>
+          <w:p>
+            <w:pPr>
+              <w:pStyle w:val="Normal"/>
+              <w:spacing w:before="0" w:after="0"/>
+              <w:rPr>
+                <w:lang w:val="es-ES"/>
+              </w:rPr>
+            </w:pPr>
+            <w:r>
+              <w:rPr>
+                <w:shd w:fill="81D41A" w:val="clear"/>
+                <w:lang w:val="es-ES"/>
+              </w:rPr>
+              <w:t>POST</w:t>
+            </w:r>
+            <w:r>
+              <w:rPr>
+                <w:lang w:val="es-ES"/>
+              </w:rPr>
               <w:t xml:space="preserve"> </w:t>
             </w:r>
             <w:r>
               <w:rPr>
-                <w:lang w:val="es-ES"/>
-              </w:rPr>
-              <w:t>remove(id)[Trz]:elimina de forma logica el elemento</w:t>
-            </w:r>
-          </w:p>
-          <w:p>
-            <w:pPr>
-              <w:pStyle w:val="Normal"/>
-              <w:spacing w:before="0" w:after="0"/>
-              <w:rPr>
-                <w:lang w:val="es-ES"/>
-              </w:rPr>
-            </w:pPr>
-            <w:r>
-              <w:rPr>
-                <w:shd w:fill="81D41A" w:val="clear"/>
-                <w:lang w:val="es-ES"/>
-              </w:rPr>
-              <w:t>POST</w:t>
-            </w:r>
-            <w:r>
-              <w:rPr>
-                <w:lang w:val="es-ES"/>
-              </w:rPr>
-              <w:t xml:space="preserve"> </w:t>
-            </w:r>
-            <w:r>
-              <w:rPr>
                 <w:shd w:fill="5983B0" w:val="clear"/>
                 <w:lang w:val="es-ES"/>
               </w:rPr>
@@ -4808,19 +4790,7 @@
               <w:rPr>
                 <w:lang w:val="es-ES"/>
               </w:rPr>
-              <w:t xml:space="preserve"> </w:t>
-            </w:r>
-            <w:r>
-              <w:rPr>
-                <w:lang w:val="es-ES"/>
-              </w:rPr>
-              <w:t xml:space="preserve">search(criterio):se busca en criterios de nombre </w:t>
-            </w:r>
-            <w:r>
-              <w:rPr>
-                <w:lang w:val="es-ES"/>
-              </w:rPr>
-              <w:t>y otros</w:t>
+              <w:t xml:space="preserve"> search(criterio):se busca en criterios de nombre y otros</w:t>
             </w:r>
           </w:p>
         </w:tc>
@@ -5733,6 +5703,21 @@
         </w:rPr>
       </w:pPr>
       <w:r>
+        <w:rPr/>
+      </w:r>
+      <w:r>
+        <w:br w:type="page"/>
+      </w:r>
+    </w:p>
+    <w:p>
+      <w:pPr>
+        <w:pStyle w:val="Heading2"/>
+        <w:ind w:hanging="0" w:left="720"/>
+        <w:rPr>
+          <w:rFonts w:eastAsia="MS Gothic"/>
+        </w:rPr>
+      </w:pPr>
+      <w:r>
         <w:rPr>
           <w:rFonts w:eastAsia="MS Gothic"/>
         </w:rPr>
@@ -7452,6 +7437,21 @@
         </w:rPr>
       </w:pPr>
       <w:r>
+        <w:rPr/>
+      </w:r>
+      <w:r>
+        <w:br w:type="page"/>
+      </w:r>
+    </w:p>
+    <w:p>
+      <w:pPr>
+        <w:pStyle w:val="Heading2"/>
+        <w:ind w:hanging="0" w:left="720"/>
+        <w:rPr>
+          <w:rFonts w:eastAsia="MS Gothic"/>
+        </w:rPr>
+      </w:pPr>
+      <w:r>
         <w:rPr>
           <w:rFonts w:eastAsia="MS Gothic"/>
         </w:rPr>
@@ -9652,6 +9652,21 @@
         <w:rPr>
           <w:lang w:val="es-ES"/>
         </w:rPr>
+      </w:r>
+    </w:p>
+    <w:p>
+      <w:pPr>
+        <w:pStyle w:val="Heading3"/>
+        <w:ind w:hanging="0" w:left="0"/>
+        <w:rPr>
+          <w:lang w:val="es-ES"/>
+        </w:rPr>
+      </w:pPr>
+      <w:r>
+        <w:rPr/>
+      </w:r>
+      <w:r>
+        <w:br w:type="page"/>
       </w:r>
     </w:p>
     <w:p>
@@ -11798,7 +11813,7 @@
     <w:pPr>
       <w:widowControl/>
       <w:suppressAutoHyphens w:val="true"/>
-      <w:overflowPunct w:val="true"/>
+      <w:overflowPunct w:val="false"/>
       <w:bidi w:val="0"/>
       <w:spacing w:before="0" w:after="160"/>
       <w:jc w:val="left"/>
@@ -12010,7 +12025,7 @@
     <w:pPr>
       <w:widowControl/>
       <w:suppressAutoHyphens w:val="true"/>
-      <w:overflowPunct w:val="true"/>
+      <w:overflowPunct w:val="false"/>
       <w:bidi w:val="0"/>
       <w:spacing w:before="0" w:after="160"/>
       <w:jc w:val="left"/>
@@ -12091,7 +12106,7 @@
     <w:pPr>
       <w:widowControl/>
       <w:suppressAutoHyphens w:val="true"/>
-      <w:overflowPunct w:val="true"/>
+      <w:overflowPunct w:val="false"/>
       <w:bidi w:val="0"/>
       <w:spacing w:before="0" w:after="0"/>
       <w:jc w:val="left"/>

</xml_diff>